<commit_message>
doc: update summary report docx with new PhoBERT performance metrics
</commit_message>
<xml_diff>
--- a/BCKL_TomTat_KsorPhuk.docx
+++ b/BCKL_TomTat_KsorPhuk.docx
@@ -1071,16 +1071,8 @@
             </w:tcMar>
           </w:tcPr>
           <w:p>
-            <w:pPr>
-              <w:spacing w:after="40" w:line="276" w:lineRule="auto"/>
-              <w:jc w:val="center"/>
-            </w:pPr>
             <w:r>
-              <w:rPr>
-                <w:rFonts w:ascii="Times New Roman" w:hAnsi="Times New Roman"/>
-                <w:sz w:val="20"/>
-              </w:rPr>
-              <w:t>97.37%</w:t>
+              <w:t>97.08%</w:t>
             </w:r>
           </w:p>
         </w:tc>
@@ -1095,16 +1087,8 @@
             </w:tcMar>
           </w:tcPr>
           <w:p>
-            <w:pPr>
-              <w:spacing w:after="40" w:line="276" w:lineRule="auto"/>
-              <w:jc w:val="center"/>
-            </w:pPr>
             <w:r>
-              <w:rPr>
-                <w:rFonts w:ascii="Times New Roman" w:hAnsi="Times New Roman"/>
-                <w:sz w:val="20"/>
-              </w:rPr>
-              <w:t>97.51%</w:t>
+              <w:t>97.34%</w:t>
             </w:r>
           </w:p>
         </w:tc>
@@ -1119,16 +1103,8 @@
             </w:tcMar>
           </w:tcPr>
           <w:p>
-            <w:pPr>
-              <w:spacing w:after="40" w:line="276" w:lineRule="auto"/>
-              <w:jc w:val="center"/>
-            </w:pPr>
             <w:r>
-              <w:rPr>
-                <w:rFonts w:ascii="Times New Roman" w:hAnsi="Times New Roman"/>
-                <w:sz w:val="20"/>
-              </w:rPr>
-              <w:t>0.0125</w:t>
+              <w:t>0.0139</w:t>
             </w:r>
           </w:p>
         </w:tc>
@@ -1143,16 +1119,8 @@
             </w:tcMar>
           </w:tcPr>
           <w:p>
-            <w:pPr>
-              <w:spacing w:after="40" w:line="276" w:lineRule="auto"/>
-              <w:jc w:val="center"/>
-            </w:pPr>
             <w:r>
-              <w:rPr>
-                <w:rFonts w:ascii="Times New Roman" w:hAnsi="Times New Roman"/>
-                <w:sz w:val="20"/>
-              </w:rPr>
-              <w:t>73.47%</w:t>
+              <w:t>74.93%</w:t>
             </w:r>
           </w:p>
         </w:tc>
@@ -1167,16 +1135,8 @@
             </w:tcMar>
           </w:tcPr>
           <w:p>
-            <w:pPr>
-              <w:spacing w:after="40" w:line="276" w:lineRule="auto"/>
-              <w:jc w:val="left"/>
-            </w:pPr>
             <w:r>
-              <w:rPr>
-                <w:rFonts w:ascii="Times New Roman" w:hAnsi="Times New Roman"/>
-                <w:sz w:val="20"/>
-              </w:rPr>
-              <w:t>73.65%</w:t>
+              <w:t>76.01%</w:t>
             </w:r>
           </w:p>
         </w:tc>
@@ -1194,11 +1154,7 @@
         <w:jc w:val="both"/>
       </w:pPr>
       <w:r>
-        <w:rPr>
-          <w:rFonts w:ascii="Times New Roman" w:hAnsi="Times New Roman"/>
-          <w:sz w:val="26"/>
-        </w:rPr>
-        <w:t>Kết quả ở Bảng 1 cho thấy mô hình PhoBERT Multi-task đạt hiệu năng gần như tuyệt đối ở bài toán nhận diện khía cạnh với F1-micro đạt 97.37% và F1-macro đạt 97.51%. Độ lỗi Hamming Loss giảm xuống mức cực thấp (0.0125). Ở nhánh phân loại cảm xúc tích hợp, PhoBERT cũng đạt độ chính xác Accuracy 73.65% và Macro F1-score 73.47%. Hiệu năng của PhoBERT vượt trội hoàn toàn so với mô hình học máy truyền thống SVM (Aspect F1-micro 85.25%) và mạng học sâu tuần tự Bi-LSTM (Aspect F1-micro 74.87%). Kết quả này biện luận rõ ràng vị thế của Transformer trong việc hiểu ngữ nghĩa sâu sắc tiếng Việt.</w:t>
+        <w:t>Kết quả ở Bảng 1 cho thấy mô hình PhoBERT Multi-task đạt hiệu năng gần như tuyệt đối ở bài toán nhận diện khía cạnh với F1-micro đạt 97.08% và F1-macro đạt 97.34%. Độ lỗi Hamming Loss giảm xuống mức cực thấp (0.0139). Ở nhánh phân loại cảm xúc tích hợp, PhoBERT cũng đạt độ chính xác Accuracy 76.01% và Macro F1-score 74.93%. Hiệu năng của PhoBERT vượt trội hoàn toàn so với mô hình học máy truyền thống SVM (Aspect F1-micro 85.25%) và mạng học sâu tuần tự Bi-LSTM (Aspect F1-micro 74.87%). Kết quả này biện luận rõ ràng vị thế của Transformer trong việc hiểu ngữ nghĩa sâu sắc tiếng Việt.</w:t>
       </w:r>
     </w:p>
     <w:p>

</xml_diff>

<commit_message>
doc: correct remaining aspect-specific metrics in main and summary docx tables and markdown files
</commit_message>
<xml_diff>
--- a/BCKL_TomTat_KsorPhuk.docx
+++ b/BCKL_TomTat_KsorPhuk.docx
@@ -1427,16 +1427,8 @@
             </w:tcMar>
           </w:tcPr>
           <w:p>
-            <w:pPr>
-              <w:spacing w:after="40" w:line="276" w:lineRule="auto"/>
-              <w:jc w:val="center"/>
-            </w:pPr>
             <w:r>
-              <w:rPr>
-                <w:rFonts w:ascii="Times New Roman" w:hAnsi="Times New Roman"/>
-                <w:sz w:val="20"/>
-              </w:rPr>
-              <w:t>96.22%</w:t>
+              <w:t>95.68%</w:t>
             </w:r>
           </w:p>
         </w:tc>
@@ -1919,16 +1911,8 @@
             </w:tcMar>
           </w:tcPr>
           <w:p>
-            <w:pPr>
-              <w:spacing w:after="40" w:line="276" w:lineRule="auto"/>
-              <w:jc w:val="center"/>
-            </w:pPr>
             <w:r>
-              <w:rPr>
-                <w:rFonts w:ascii="Times New Roman" w:hAnsi="Times New Roman"/>
-                <w:sz w:val="20"/>
-              </w:rPr>
-              <w:t>98.37%</w:t>
+              <w:t>98.10%</w:t>
             </w:r>
           </w:p>
         </w:tc>

</xml_diff>